<commit_message>
:bento: add columns to alter by code
</commit_message>
<xml_diff>
--- a/public/planejamentoSemanal7.docx
+++ b/public/planejamentoSemanal7.docx
@@ -134,7 +134,27 @@
                 <w:shd w:fill="auto" w:val="clear"/>
                 <w:vertAlign w:val="baseline"/>
               </w:rPr>
-              <w:t>N</w:t>
+              <w:t>{</w:t>
+            </w:r>
+            <w:r>
+              <w:rPr>
+                <w:rFonts w:eastAsia="Arial" w:cs="Arial" w:ascii="Arial" w:hAnsi="Arial"/>
+                <w:b/>
+                <w:i w:val="false"/>
+                <w:caps w:val="false"/>
+                <w:smallCaps w:val="false"/>
+                <w:strike w:val="false"/>
+                <w:dstrike w:val="false"/>
+                <w:color w:val="000000"/>
+                <w:position w:val="0"/>
+                <w:sz w:val="24"/>
+                <w:sz w:val="24"/>
+                <w:szCs w:val="24"/>
+                <w:u w:val="none"/>
+                <w:shd w:fill="auto" w:val="clear"/>
+                <w:vertAlign w:val="baseline"/>
+              </w:rPr>
+              <w:t>n</w:t>
             </w:r>
             <w:r>
               <w:rPr>
@@ -194,66 +214,6 @@
                 <w:shd w:fill="auto" w:val="clear"/>
                 <w:vertAlign w:val="baseline"/>
               </w:rPr>
-              <w:t xml:space="preserve">e </w:t>
-            </w:r>
-            <w:r>
-              <w:rPr>
-                <w:rFonts w:eastAsia="Arial" w:cs="Arial" w:ascii="Arial" w:hAnsi="Arial"/>
-                <w:b/>
-                <w:i w:val="false"/>
-                <w:caps w:val="false"/>
-                <w:smallCaps w:val="false"/>
-                <w:strike w:val="false"/>
-                <w:dstrike w:val="false"/>
-                <w:color w:val="000000"/>
-                <w:position w:val="0"/>
-                <w:sz w:val="24"/>
-                <w:sz w:val="24"/>
-                <w:szCs w:val="24"/>
-                <w:u w:val="none"/>
-                <w:shd w:fill="auto" w:val="clear"/>
-                <w:vertAlign w:val="baseline"/>
-              </w:rPr>
-              <w:t>d</w:t>
-            </w:r>
-            <w:r>
-              <w:rPr>
-                <w:rFonts w:eastAsia="Arial" w:cs="Arial" w:ascii="Arial" w:hAnsi="Arial"/>
-                <w:b/>
-                <w:i w:val="false"/>
-                <w:caps w:val="false"/>
-                <w:smallCaps w:val="false"/>
-                <w:strike w:val="false"/>
-                <w:dstrike w:val="false"/>
-                <w:color w:val="000000"/>
-                <w:position w:val="0"/>
-                <w:sz w:val="24"/>
-                <w:sz w:val="24"/>
-                <w:szCs w:val="24"/>
-                <w:u w:val="none"/>
-                <w:shd w:fill="auto" w:val="clear"/>
-                <w:vertAlign w:val="baseline"/>
-              </w:rPr>
-              <w:t xml:space="preserve">a </w:t>
-            </w:r>
-            <w:r>
-              <w:rPr>
-                <w:rFonts w:eastAsia="Arial" w:cs="Arial" w:ascii="Arial" w:hAnsi="Arial"/>
-                <w:b/>
-                <w:i w:val="false"/>
-                <w:caps w:val="false"/>
-                <w:smallCaps w:val="false"/>
-                <w:strike w:val="false"/>
-                <w:dstrike w:val="false"/>
-                <w:color w:val="000000"/>
-                <w:position w:val="0"/>
-                <w:sz w:val="24"/>
-                <w:sz w:val="24"/>
-                <w:szCs w:val="24"/>
-                <w:u w:val="none"/>
-                <w:shd w:fill="auto" w:val="clear"/>
-                <w:vertAlign w:val="baseline"/>
-              </w:rPr>
               <w:t>e</w:t>
             </w:r>
             <w:r>
@@ -274,6 +234,26 @@
                 <w:shd w:fill="auto" w:val="clear"/>
                 <w:vertAlign w:val="baseline"/>
               </w:rPr>
+              <w:t>E</w:t>
+            </w:r>
+            <w:r>
+              <w:rPr>
+                <w:rFonts w:eastAsia="Arial" w:cs="Arial" w:ascii="Arial" w:hAnsi="Arial"/>
+                <w:b/>
+                <w:i w:val="false"/>
+                <w:caps w:val="false"/>
+                <w:smallCaps w:val="false"/>
+                <w:strike w:val="false"/>
+                <w:dstrike w:val="false"/>
+                <w:color w:val="000000"/>
+                <w:position w:val="0"/>
+                <w:sz w:val="24"/>
+                <w:sz w:val="24"/>
+                <w:szCs w:val="24"/>
+                <w:u w:val="none"/>
+                <w:shd w:fill="auto" w:val="clear"/>
+                <w:vertAlign w:val="baseline"/>
+              </w:rPr>
               <w:t>s</w:t>
             </w:r>
             <w:r>
@@ -354,168 +334,27 @@
                 <w:shd w:fill="auto" w:val="clear"/>
                 <w:vertAlign w:val="baseline"/>
               </w:rPr>
-              <w:t>a</w:t>
-            </w:r>
-            <w:r>
-              <w:rPr>
-                <w:rFonts w:eastAsia="Arial" w:cs="Arial" w:ascii="Arial" w:hAnsi="Arial"/>
-                <w:b/>
-                <w:i w:val="false"/>
-                <w:caps w:val="false"/>
-                <w:smallCaps w:val="false"/>
-                <w:strike w:val="false"/>
-                <w:dstrike w:val="false"/>
-                <w:color w:val="000000"/>
-                <w:position w:val="0"/>
-                <w:sz w:val="24"/>
-                <w:sz w:val="24"/>
-                <w:szCs w:val="24"/>
-                <w:u w:val="none"/>
-                <w:shd w:fill="auto" w:val="clear"/>
-                <w:vertAlign w:val="baseline"/>
-              </w:rPr>
-              <w:tab/>
-            </w:r>
-            <w:r>
-              <w:rPr>
-                <w:rFonts w:eastAsia="Arial" w:cs="Arial" w:ascii="Arial" w:hAnsi="Arial"/>
-                <w:b/>
-                <w:i w:val="false"/>
-                <w:caps w:val="false"/>
-                <w:smallCaps w:val="false"/>
-                <w:strike w:val="false"/>
-                <w:dstrike w:val="false"/>
-                <w:color w:val="000000"/>
-                <w:position w:val="0"/>
-                <w:sz w:val="24"/>
-                <w:sz w:val="24"/>
-                <w:szCs w:val="24"/>
-                <w:u w:val="none"/>
-                <w:shd w:fill="auto" w:val="clear"/>
-                <w:vertAlign w:val="baseline"/>
-              </w:rPr>
-              <w:t>{</w:t>
-            </w:r>
-            <w:r>
-              <w:rPr>
-                <w:rFonts w:eastAsia="Arial" w:cs="Arial" w:ascii="Arial" w:hAnsi="Arial"/>
-                <w:b/>
-                <w:i w:val="false"/>
-                <w:caps w:val="false"/>
-                <w:smallCaps w:val="false"/>
-                <w:strike w:val="false"/>
-                <w:dstrike w:val="false"/>
-                <w:color w:val="000000"/>
-                <w:position w:val="0"/>
-                <w:sz w:val="24"/>
-                <w:sz w:val="24"/>
-                <w:szCs w:val="24"/>
-                <w:u w:val="none"/>
-                <w:shd w:fill="auto" w:val="clear"/>
-                <w:vertAlign w:val="baseline"/>
-              </w:rPr>
-              <w:t>s</w:t>
-            </w:r>
-            <w:r>
-              <w:rPr>
-                <w:rFonts w:eastAsia="Arial" w:cs="Arial" w:ascii="Arial" w:hAnsi="Arial"/>
-                <w:b/>
-                <w:i w:val="false"/>
-                <w:caps w:val="false"/>
-                <w:smallCaps w:val="false"/>
-                <w:strike w:val="false"/>
-                <w:dstrike w:val="false"/>
-                <w:color w:val="000000"/>
-                <w:position w:val="0"/>
-                <w:sz w:val="24"/>
-                <w:sz w:val="24"/>
-                <w:szCs w:val="24"/>
-                <w:u w:val="none"/>
-                <w:shd w:fill="auto" w:val="clear"/>
-                <w:vertAlign w:val="baseline"/>
-              </w:rPr>
-              <w:t>a</w:t>
-            </w:r>
-            <w:r>
-              <w:rPr>
-                <w:rFonts w:eastAsia="Arial" w:cs="Arial" w:ascii="Arial" w:hAnsi="Arial"/>
-                <w:b/>
-                <w:i w:val="false"/>
-                <w:caps w:val="false"/>
-                <w:smallCaps w:val="false"/>
-                <w:strike w:val="false"/>
-                <w:dstrike w:val="false"/>
-                <w:color w:val="000000"/>
-                <w:position w:val="0"/>
-                <w:sz w:val="24"/>
-                <w:sz w:val="24"/>
-                <w:szCs w:val="24"/>
-                <w:u w:val="none"/>
-                <w:shd w:fill="auto" w:val="clear"/>
-                <w:vertAlign w:val="baseline"/>
-              </w:rPr>
-              <w:t>l</w:t>
-            </w:r>
-            <w:r>
-              <w:rPr>
-                <w:rFonts w:eastAsia="Arial" w:cs="Arial" w:ascii="Arial" w:hAnsi="Arial"/>
-                <w:b/>
-                <w:i w:val="false"/>
-                <w:caps w:val="false"/>
-                <w:smallCaps w:val="false"/>
-                <w:strike w:val="false"/>
-                <w:dstrike w:val="false"/>
-                <w:color w:val="000000"/>
-                <w:position w:val="0"/>
-                <w:sz w:val="24"/>
-                <w:sz w:val="24"/>
-                <w:szCs w:val="24"/>
-                <w:u w:val="none"/>
-                <w:shd w:fill="auto" w:val="clear"/>
-                <w:vertAlign w:val="baseline"/>
-              </w:rPr>
-              <w:t>a</w:t>
-            </w:r>
-            <w:r>
-              <w:rPr>
-                <w:rFonts w:eastAsia="Arial" w:cs="Arial" w:ascii="Arial" w:hAnsi="Arial"/>
-                <w:b/>
-                <w:i w:val="false"/>
-                <w:caps w:val="false"/>
-                <w:smallCaps w:val="false"/>
-                <w:strike w:val="false"/>
-                <w:dstrike w:val="false"/>
-                <w:color w:val="000000"/>
-                <w:position w:val="0"/>
-                <w:sz w:val="24"/>
-                <w:sz w:val="24"/>
-                <w:szCs w:val="24"/>
-                <w:u w:val="none"/>
-                <w:shd w:fill="auto" w:val="clear"/>
-                <w:vertAlign w:val="baseline"/>
-              </w:rPr>
-              <w:t>}</w:t>
-            </w:r>
-            <w:r>
-              <w:rPr>
-                <w:rFonts w:eastAsia="Arial" w:cs="Arial" w:ascii="Arial" w:hAnsi="Arial"/>
-                <w:b/>
-                <w:i w:val="false"/>
-                <w:caps w:val="false"/>
-                <w:smallCaps w:val="false"/>
-                <w:strike w:val="false"/>
-                <w:dstrike w:val="false"/>
-                <w:color w:val="000000"/>
-                <w:position w:val="0"/>
-                <w:sz w:val="24"/>
-                <w:sz w:val="24"/>
-                <w:szCs w:val="24"/>
-                <w:u w:val="none"/>
-                <w:shd w:fill="auto" w:val="clear"/>
-                <w:vertAlign w:val="baseline"/>
-              </w:rPr>
-              <w:tab/>
-              <w:t>PROFª {profName}</w:t>
+              <w:t xml:space="preserve">a – </w:t>
+            </w:r>
+            <w:r>
+              <w:rPr>
+                <w:rFonts w:eastAsia="Arial" w:cs="Arial" w:ascii="Arial" w:hAnsi="Arial"/>
+                <w:b/>
+                <w:i w:val="false"/>
+                <w:caps w:val="false"/>
+                <w:smallCaps w:val="false"/>
+                <w:strike w:val="false"/>
+                <w:dstrike w:val="false"/>
+                <w:color w:val="000000"/>
+                <w:position w:val="0"/>
+                <w:sz w:val="24"/>
+                <w:sz w:val="24"/>
+                <w:szCs w:val="24"/>
+                <w:u w:val="none"/>
+                <w:shd w:fill="auto" w:val="clear"/>
+                <w:vertAlign w:val="baseline"/>
+              </w:rPr>
+              <w:t>{sala} -PROFª {profName}</w:t>
             </w:r>
           </w:p>
           <w:p>
@@ -535,38 +374,34 @@
                 <w:tab w:val="left" w:pos="11248" w:leader="none"/>
               </w:tabs>
               <w:spacing w:lineRule="auto" w:line="271" w:before="0" w:after="0"/>
-              <w:ind w:hanging="671" w:left="3556" w:right="2883"/>
-              <w:jc w:val="left"/>
-              <w:rPr>
-                <w:rFonts w:ascii="Arial" w:hAnsi="Arial"/>
-                <w:color w:val="000000"/>
-                <w:sz w:val="24"/>
-                <w:szCs w:val="24"/>
-              </w:rPr>
-            </w:pPr>
-            <w:r>
-              <w:rPr>
-                <w:rFonts w:eastAsia="Arial" w:cs="Arial" w:ascii="Arial" w:hAnsi="Arial"/>
-                <w:b/>
-                <w:i w:val="false"/>
-                <w:caps w:val="false"/>
-                <w:smallCaps w:val="false"/>
-                <w:strike w:val="false"/>
-                <w:dstrike w:val="false"/>
-                <w:color w:val="000000"/>
-                <w:position w:val="0"/>
-                <w:sz w:val="24"/>
-                <w:sz w:val="24"/>
-                <w:szCs w:val="24"/>
-                <w:u w:val="none"/>
-                <w:shd w:fill="auto" w:val="clear"/>
-                <w:vertAlign w:val="baseline"/>
-              </w:rPr>
-              <w:t>R O T I N A</w:t>
-              <w:tab/>
-              <w:t>S E M A N A L</w:t>
-              <w:tab/>
-              <w:t xml:space="preserve">- {diaStart} </w:t>
+              <w:ind w:hanging="0" w:left="0" w:right="2883"/>
+              <w:jc w:val="left"/>
+              <w:rPr>
+                <w:rFonts w:ascii="Arial" w:hAnsi="Arial"/>
+                <w:color w:val="000000"/>
+                <w:sz w:val="24"/>
+                <w:szCs w:val="24"/>
+              </w:rPr>
+            </w:pPr>
+            <w:r>
+              <w:rPr>
+                <w:rFonts w:eastAsia="Arial" w:cs="Arial" w:ascii="Arial" w:hAnsi="Arial"/>
+                <w:b/>
+                <w:i w:val="false"/>
+                <w:caps w:val="false"/>
+                <w:smallCaps w:val="false"/>
+                <w:strike w:val="false"/>
+                <w:dstrike w:val="false"/>
+                <w:color w:val="000000"/>
+                <w:position w:val="0"/>
+                <w:sz w:val="24"/>
+                <w:sz w:val="24"/>
+                <w:szCs w:val="24"/>
+                <w:u w:val="none"/>
+                <w:shd w:fill="auto" w:val="clear"/>
+                <w:vertAlign w:val="baseline"/>
+              </w:rPr>
+              <w:t xml:space="preserve">ROTINA SEMANAL - {diaStart} </w:t>
             </w:r>
             <w:r>
               <w:rPr>
@@ -586,20 +421,107 @@
                 <w:shd w:fill="auto" w:val="clear"/>
                 <w:vertAlign w:val="baseline"/>
               </w:rPr>
-              <w:t xml:space="preserve"> A {diaEnd} DE {mes}  D E </w:t>
-              <w:tab/>
-              <w:t xml:space="preserve">2 0 2 </w:t>
-            </w:r>
-            <w:r>
-              <w:rPr>
-                <w:rFonts w:eastAsia="Arial" w:cs="Arial" w:ascii="Arial" w:hAnsi="Arial"/>
-                <w:b/>
-                <w:color w:val="000000"/>
+              <w:t xml:space="preserve"> A {diaEnd} DE {mes}  DE </w:t>
+            </w:r>
+            <w:r>
+              <w:rPr>
+                <w:rFonts w:eastAsia="Arial" w:cs="Arial" w:ascii="Arial" w:hAnsi="Arial"/>
+                <w:b/>
+                <w:i w:val="false"/>
+                <w:caps w:val="false"/>
+                <w:smallCaps w:val="false"/>
+                <w:strike w:val="false"/>
+                <w:dstrike w:val="false"/>
+                <w:color w:val="000000"/>
+                <w:position w:val="0"/>
+                <w:sz w:val="24"/>
                 <w:sz w:val="24"/>
                 <w:szCs w:val="24"/>
                 <w:u w:val="single"/>
-              </w:rPr>
-              <w:t>5</w:t>
+                <w:shd w:fill="auto" w:val="clear"/>
+                <w:vertAlign w:val="baseline"/>
+              </w:rPr>
+              <w:t>{</w:t>
+            </w:r>
+            <w:r>
+              <w:rPr>
+                <w:rFonts w:eastAsia="Arial" w:cs="Arial" w:ascii="Arial" w:hAnsi="Arial"/>
+                <w:b/>
+                <w:i w:val="false"/>
+                <w:caps w:val="false"/>
+                <w:smallCaps w:val="false"/>
+                <w:strike w:val="false"/>
+                <w:dstrike w:val="false"/>
+                <w:color w:val="000000"/>
+                <w:position w:val="0"/>
+                <w:sz w:val="24"/>
+                <w:sz w:val="24"/>
+                <w:szCs w:val="24"/>
+                <w:u w:val="single"/>
+                <w:shd w:fill="auto" w:val="clear"/>
+                <w:vertAlign w:val="baseline"/>
+              </w:rPr>
+              <w:t>a</w:t>
+            </w:r>
+            <w:r>
+              <w:rPr>
+                <w:rFonts w:eastAsia="Arial" w:cs="Arial" w:ascii="Arial" w:hAnsi="Arial"/>
+                <w:b/>
+                <w:i w:val="false"/>
+                <w:caps w:val="false"/>
+                <w:smallCaps w:val="false"/>
+                <w:strike w:val="false"/>
+                <w:dstrike w:val="false"/>
+                <w:color w:val="000000"/>
+                <w:position w:val="0"/>
+                <w:sz w:val="24"/>
+                <w:sz w:val="24"/>
+                <w:szCs w:val="24"/>
+                <w:u w:val="single"/>
+                <w:shd w:fill="auto" w:val="clear"/>
+                <w:vertAlign w:val="baseline"/>
+              </w:rPr>
+              <w:t>n</w:t>
+            </w:r>
+            <w:r>
+              <w:rPr>
+                <w:rFonts w:eastAsia="Arial" w:cs="Arial" w:ascii="Arial" w:hAnsi="Arial"/>
+                <w:b/>
+                <w:i w:val="false"/>
+                <w:caps w:val="false"/>
+                <w:smallCaps w:val="false"/>
+                <w:strike w:val="false"/>
+                <w:dstrike w:val="false"/>
+                <w:color w:val="000000"/>
+                <w:position w:val="0"/>
+                <w:sz w:val="24"/>
+                <w:sz w:val="24"/>
+                <w:szCs w:val="24"/>
+                <w:u w:val="single"/>
+                <w:shd w:fill="auto" w:val="clear"/>
+                <w:vertAlign w:val="baseline"/>
+              </w:rPr>
+              <w:t>o</w:t>
+            </w:r>
+            <w:r>
+              <w:rPr>
+                <w:rFonts w:eastAsia="Arial" w:cs="Arial" w:ascii="Arial" w:hAnsi="Arial"/>
+                <w:b/>
+                <w:i w:val="false"/>
+                <w:caps w:val="false"/>
+                <w:smallCaps w:val="false"/>
+                <w:strike w:val="false"/>
+                <w:dstrike w:val="false"/>
+                <w:color w:val="000000"/>
+                <w:position w:val="0"/>
+                <w:sz w:val="24"/>
+                <w:sz w:val="24"/>
+                <w:szCs w:val="24"/>
+                <w:u w:val="single"/>
+                <w:shd w:fill="auto" w:val="clear"/>
+                <w:vertAlign w:val="baseline"/>
+              </w:rPr>
+              <w:t>}</w:t>
             </w:r>
           </w:p>
         </w:tc>

</xml_diff>